<commit_message>
the glossary word is a chip you can find by scanning
She could not pick a term out of its own entry. The name was green and bold at
the same size as the definition that followed it, so it merged with the line.
Each term now sits on a pale green chip, in a darker green, one step larger than
the body. Scanning for the word is now a matter of looking for the chip rather
than reading.

The header line on the printable version explaining the colour code and the
reading order came off. A cheat sheet is read under time pressure by somebody
who already knows what is on it, so a line telling her what the thing consists
of is taking space from the content.

Converting to PDF again: still two pages, nothing split.
</commit_message>
<xml_diff>
--- a/exam-1/PHI2394 exam 1 cheat sheet.docx
+++ b/exam-1/PHI2394 exam 1 cheat sheet.docx
@@ -3064,10 +3064,21 @@
           <w:rFonts w:ascii="Calibri" w:hAnsi="Calibri"/>
           <w:b/>
           <w:i w:val="0"/>
-          <w:color w:val="1A6450"/>
+          <w:color w:val="0C3F31"/>
+          <w:sz w:val="16"/>
+          <w:shd w:val="clear" w:color="auto" w:fill="C4E3D4"/>
+        </w:rPr>
+        <w:t xml:space="preserve"> Ad hoc </w:t>
+      </w:r>
+      <w:r>
+        <w:rPr>
+          <w:rFonts w:ascii="Calibri" w:hAnsi="Calibri"/>
+          <w:b w:val="0"/>
+          <w:i w:val="0"/>
+          <w:color w:val="3C4A42"/>
           <w:sz w:val="14"/>
         </w:rPr>
-        <w:t xml:space="preserve">Ad hoc </w:t>
+        <w:t xml:space="preserve"> </w:t>
       </w:r>
       <w:r>
         <w:rPr>
@@ -3111,10 +3122,21 @@
           <w:rFonts w:ascii="Calibri" w:hAnsi="Calibri"/>
           <w:b/>
           <w:i w:val="0"/>
-          <w:color w:val="1A6450"/>
+          <w:color w:val="0C3F31"/>
+          <w:sz w:val="16"/>
+          <w:shd w:val="clear" w:color="auto" w:fill="C4E3D4"/>
+        </w:rPr>
+        <w:t xml:space="preserve"> Contingent </w:t>
+      </w:r>
+      <w:r>
+        <w:rPr>
+          <w:rFonts w:ascii="Calibri" w:hAnsi="Calibri"/>
+          <w:b w:val="0"/>
+          <w:i w:val="0"/>
+          <w:color w:val="3C4A42"/>
           <w:sz w:val="14"/>
         </w:rPr>
-        <w:t xml:space="preserve">Contingent </w:t>
+        <w:t xml:space="preserve"> </w:t>
       </w:r>
       <w:r>
         <w:rPr>
@@ -3158,10 +3180,21 @@
           <w:rFonts w:ascii="Calibri" w:hAnsi="Calibri"/>
           <w:b/>
           <w:i w:val="0"/>
-          <w:color w:val="1A6450"/>
+          <w:color w:val="0C3F31"/>
+          <w:sz w:val="16"/>
+          <w:shd w:val="clear" w:color="auto" w:fill="C4E3D4"/>
+        </w:rPr>
+        <w:t xml:space="preserve"> Metaphysics </w:t>
+      </w:r>
+      <w:r>
+        <w:rPr>
+          <w:rFonts w:ascii="Calibri" w:hAnsi="Calibri"/>
+          <w:b w:val="0"/>
+          <w:i w:val="0"/>
+          <w:color w:val="3C4A42"/>
           <w:sz w:val="14"/>
         </w:rPr>
-        <w:t xml:space="preserve">Metaphysics </w:t>
+        <w:t xml:space="preserve"> </w:t>
       </w:r>
       <w:r>
         <w:rPr>
@@ -3205,10 +3238,21 @@
           <w:rFonts w:ascii="Calibri" w:hAnsi="Calibri"/>
           <w:b/>
           <w:i w:val="0"/>
-          <w:color w:val="1A6450"/>
+          <w:color w:val="0C3F31"/>
+          <w:sz w:val="16"/>
+          <w:shd w:val="clear" w:color="auto" w:fill="C4E3D4"/>
+        </w:rPr>
+        <w:t xml:space="preserve"> Dualism </w:t>
+      </w:r>
+      <w:r>
+        <w:rPr>
+          <w:rFonts w:ascii="Calibri" w:hAnsi="Calibri"/>
+          <w:b w:val="0"/>
+          <w:i w:val="0"/>
+          <w:color w:val="3C4A42"/>
           <w:sz w:val="14"/>
         </w:rPr>
-        <w:t xml:space="preserve">Dualism </w:t>
+        <w:t xml:space="preserve"> </w:t>
       </w:r>
       <w:r>
         <w:rPr>
@@ -3250,10 +3294,21 @@
           <w:rFonts w:ascii="Calibri" w:hAnsi="Calibri"/>
           <w:b/>
           <w:i w:val="0"/>
-          <w:color w:val="1A6450"/>
+          <w:color w:val="0C3F31"/>
+          <w:sz w:val="16"/>
+          <w:shd w:val="clear" w:color="auto" w:fill="C4E3D4"/>
+        </w:rPr>
+        <w:t xml:space="preserve"> Homer </w:t>
+      </w:r>
+      <w:r>
+        <w:rPr>
+          <w:rFonts w:ascii="Calibri" w:hAnsi="Calibri"/>
+          <w:b w:val="0"/>
+          <w:i w:val="0"/>
+          <w:color w:val="3C4A42"/>
           <w:sz w:val="14"/>
         </w:rPr>
-        <w:t xml:space="preserve">Homer </w:t>
+        <w:t xml:space="preserve"> </w:t>
       </w:r>
       <w:r>
         <w:rPr>
@@ -3307,10 +3362,21 @@
           <w:rFonts w:ascii="Calibri" w:hAnsi="Calibri"/>
           <w:b/>
           <w:i w:val="0"/>
-          <w:color w:val="1A6450"/>
+          <w:color w:val="0C3F31"/>
+          <w:sz w:val="16"/>
+          <w:shd w:val="clear" w:color="auto" w:fill="C4E3D4"/>
+        </w:rPr>
+        <w:t xml:space="preserve"> Heraclitus </w:t>
+      </w:r>
+      <w:r>
+        <w:rPr>
+          <w:rFonts w:ascii="Calibri" w:hAnsi="Calibri"/>
+          <w:b w:val="0"/>
+          <w:i w:val="0"/>
+          <w:color w:val="3C4A42"/>
           <w:sz w:val="14"/>
         </w:rPr>
-        <w:t xml:space="preserve">Heraclitus </w:t>
+        <w:t xml:space="preserve"> </w:t>
       </w:r>
       <w:r>
         <w:rPr>
@@ -3344,10 +3410,21 @@
           <w:rFonts w:ascii="Calibri" w:hAnsi="Calibri"/>
           <w:b/>
           <w:i w:val="0"/>
-          <w:color w:val="1A6450"/>
+          <w:color w:val="0C3F31"/>
+          <w:sz w:val="16"/>
+          <w:shd w:val="clear" w:color="auto" w:fill="C4E3D4"/>
+        </w:rPr>
+        <w:t xml:space="preserve"> Aristotle </w:t>
+      </w:r>
+      <w:r>
+        <w:rPr>
+          <w:rFonts w:ascii="Calibri" w:hAnsi="Calibri"/>
+          <w:b w:val="0"/>
+          <w:i w:val="0"/>
+          <w:color w:val="3C4A42"/>
           <w:sz w:val="14"/>
         </w:rPr>
-        <w:t xml:space="preserve">Aristotle </w:t>
+        <w:t xml:space="preserve"> </w:t>
       </w:r>
       <w:r>
         <w:rPr>
@@ -3381,10 +3458,21 @@
           <w:rFonts w:ascii="Calibri" w:hAnsi="Calibri"/>
           <w:b/>
           <w:i w:val="0"/>
-          <w:color w:val="1A6450"/>
+          <w:color w:val="0C3F31"/>
+          <w:sz w:val="16"/>
+          <w:shd w:val="clear" w:color="auto" w:fill="C4E3D4"/>
+        </w:rPr>
+        <w:t xml:space="preserve"> Geocentrism </w:t>
+      </w:r>
+      <w:r>
+        <w:rPr>
+          <w:rFonts w:ascii="Calibri" w:hAnsi="Calibri"/>
+          <w:b w:val="0"/>
+          <w:i w:val="0"/>
+          <w:color w:val="3C4A42"/>
           <w:sz w:val="14"/>
         </w:rPr>
-        <w:t xml:space="preserve">Geocentrism </w:t>
+        <w:t xml:space="preserve"> </w:t>
       </w:r>
       <w:r>
         <w:rPr>
@@ -3438,10 +3526,21 @@
           <w:rFonts w:ascii="Calibri" w:hAnsi="Calibri"/>
           <w:b/>
           <w:i w:val="0"/>
-          <w:color w:val="1A6450"/>
+          <w:color w:val="0C3F31"/>
+          <w:sz w:val="16"/>
+          <w:shd w:val="clear" w:color="auto" w:fill="C4E3D4"/>
+        </w:rPr>
+        <w:t xml:space="preserve"> The Academy </w:t>
+      </w:r>
+      <w:r>
+        <w:rPr>
+          <w:rFonts w:ascii="Calibri" w:hAnsi="Calibri"/>
+          <w:b w:val="0"/>
+          <w:i w:val="0"/>
+          <w:color w:val="3C4A42"/>
           <w:sz w:val="14"/>
         </w:rPr>
-        <w:t xml:space="preserve">The Academy </w:t>
+        <w:t xml:space="preserve"> </w:t>
       </w:r>
       <w:r>
         <w:rPr>
@@ -3475,10 +3574,21 @@
           <w:rFonts w:ascii="Calibri" w:hAnsi="Calibri"/>
           <w:b/>
           <w:i w:val="0"/>
-          <w:color w:val="1A6450"/>
+          <w:color w:val="0C3F31"/>
+          <w:sz w:val="16"/>
+          <w:shd w:val="clear" w:color="auto" w:fill="C4E3D4"/>
+        </w:rPr>
+        <w:t xml:space="preserve"> The cave </w:t>
+      </w:r>
+      <w:r>
+        <w:rPr>
+          <w:rFonts w:ascii="Calibri" w:hAnsi="Calibri"/>
+          <w:b w:val="0"/>
+          <w:i w:val="0"/>
+          <w:color w:val="3C4A42"/>
           <w:sz w:val="14"/>
         </w:rPr>
-        <w:t xml:space="preserve">The cave </w:t>
+        <w:t xml:space="preserve"> </w:t>
       </w:r>
       <w:r>
         <w:rPr>
@@ -3572,10 +3682,21 @@
           <w:rFonts w:ascii="Calibri" w:hAnsi="Calibri"/>
           <w:b/>
           <w:i w:val="0"/>
-          <w:color w:val="1A6450"/>
+          <w:color w:val="0C3F31"/>
+          <w:sz w:val="16"/>
+          <w:shd w:val="clear" w:color="auto" w:fill="C4E3D4"/>
+        </w:rPr>
+        <w:t xml:space="preserve"> physis </w:t>
+      </w:r>
+      <w:r>
+        <w:rPr>
+          <w:rFonts w:ascii="Calibri" w:hAnsi="Calibri"/>
+          <w:b w:val="0"/>
+          <w:i w:val="0"/>
+          <w:color w:val="3C4A42"/>
           <w:sz w:val="14"/>
         </w:rPr>
-        <w:t xml:space="preserve">physis </w:t>
+        <w:t xml:space="preserve"> </w:t>
       </w:r>
       <w:r>
         <w:rPr>
@@ -3609,10 +3730,21 @@
           <w:rFonts w:ascii="Calibri" w:hAnsi="Calibri"/>
           <w:b/>
           <w:i w:val="0"/>
-          <w:color w:val="1A6450"/>
+          <w:color w:val="0C3F31"/>
+          <w:sz w:val="16"/>
+          <w:shd w:val="clear" w:color="auto" w:fill="C4E3D4"/>
+        </w:rPr>
+        <w:t xml:space="preserve"> techne </w:t>
+      </w:r>
+      <w:r>
+        <w:rPr>
+          <w:rFonts w:ascii="Calibri" w:hAnsi="Calibri"/>
+          <w:b w:val="0"/>
+          <w:i w:val="0"/>
+          <w:color w:val="3C4A42"/>
           <w:sz w:val="14"/>
         </w:rPr>
-        <w:t xml:space="preserve">techne </w:t>
+        <w:t xml:space="preserve"> </w:t>
       </w:r>
       <w:r>
         <w:rPr>
@@ -3646,10 +3778,21 @@
           <w:rFonts w:ascii="Calibri" w:hAnsi="Calibri"/>
           <w:b/>
           <w:i w:val="0"/>
-          <w:color w:val="1A6450"/>
+          <w:color w:val="0C3F31"/>
+          <w:sz w:val="16"/>
+          <w:shd w:val="clear" w:color="auto" w:fill="C4E3D4"/>
+        </w:rPr>
+        <w:t xml:space="preserve"> episteme </w:t>
+      </w:r>
+      <w:r>
+        <w:rPr>
+          <w:rFonts w:ascii="Calibri" w:hAnsi="Calibri"/>
+          <w:b w:val="0"/>
+          <w:i w:val="0"/>
+          <w:color w:val="3C4A42"/>
           <w:sz w:val="14"/>
         </w:rPr>
-        <w:t xml:space="preserve">episteme </w:t>
+        <w:t xml:space="preserve"> </w:t>
       </w:r>
       <w:r>
         <w:rPr>
@@ -3683,10 +3826,21 @@
           <w:rFonts w:ascii="Calibri" w:hAnsi="Calibri"/>
           <w:b/>
           <w:i w:val="0"/>
-          <w:color w:val="1A6450"/>
+          <w:color w:val="0C3F31"/>
+          <w:sz w:val="16"/>
+          <w:shd w:val="clear" w:color="auto" w:fill="C4E3D4"/>
+        </w:rPr>
+        <w:t xml:space="preserve"> empeiria </w:t>
+      </w:r>
+      <w:r>
+        <w:rPr>
+          <w:rFonts w:ascii="Calibri" w:hAnsi="Calibri"/>
+          <w:b w:val="0"/>
+          <w:i w:val="0"/>
+          <w:color w:val="3C4A42"/>
           <w:sz w:val="14"/>
         </w:rPr>
-        <w:t xml:space="preserve">empeiria </w:t>
+        <w:t xml:space="preserve"> </w:t>
       </w:r>
       <w:r>
         <w:rPr>
@@ -3720,10 +3874,21 @@
           <w:rFonts w:ascii="Calibri" w:hAnsi="Calibri"/>
           <w:b/>
           <w:i w:val="0"/>
-          <w:color w:val="1A6450"/>
+          <w:color w:val="0C3F31"/>
+          <w:sz w:val="16"/>
+          <w:shd w:val="clear" w:color="auto" w:fill="C4E3D4"/>
+        </w:rPr>
+        <w:t xml:space="preserve"> atechnia </w:t>
+      </w:r>
+      <w:r>
+        <w:rPr>
+          <w:rFonts w:ascii="Calibri" w:hAnsi="Calibri"/>
+          <w:b w:val="0"/>
+          <w:i w:val="0"/>
+          <w:color w:val="3C4A42"/>
           <w:sz w:val="14"/>
         </w:rPr>
-        <w:t xml:space="preserve">atechnia </w:t>
+        <w:t xml:space="preserve"> </w:t>
       </w:r>
       <w:r>
         <w:rPr>
@@ -3757,10 +3922,21 @@
           <w:rFonts w:ascii="Calibri" w:hAnsi="Calibri"/>
           <w:b/>
           <w:i w:val="0"/>
-          <w:color w:val="1A6450"/>
+          <w:color w:val="0C3F31"/>
+          <w:sz w:val="16"/>
+          <w:shd w:val="clear" w:color="auto" w:fill="C4E3D4"/>
+        </w:rPr>
+        <w:t xml:space="preserve"> telos </w:t>
+      </w:r>
+      <w:r>
+        <w:rPr>
+          <w:rFonts w:ascii="Calibri" w:hAnsi="Calibri"/>
+          <w:b w:val="0"/>
+          <w:i w:val="0"/>
+          <w:color w:val="3C4A42"/>
           <w:sz w:val="14"/>
         </w:rPr>
-        <w:t xml:space="preserve">telos </w:t>
+        <w:t xml:space="preserve"> </w:t>
       </w:r>
       <w:r>
         <w:rPr>
@@ -3814,10 +3990,21 @@
           <w:rFonts w:ascii="Calibri" w:hAnsi="Calibri"/>
           <w:b/>
           <w:i w:val="0"/>
-          <w:color w:val="1A6450"/>
+          <w:color w:val="0C3F31"/>
+          <w:sz w:val="16"/>
+          <w:shd w:val="clear" w:color="auto" w:fill="C4E3D4"/>
+        </w:rPr>
+        <w:t xml:space="preserve"> Form </w:t>
+      </w:r>
+      <w:r>
+        <w:rPr>
+          <w:rFonts w:ascii="Calibri" w:hAnsi="Calibri"/>
+          <w:b w:val="0"/>
+          <w:i w:val="0"/>
+          <w:color w:val="3C4A42"/>
           <w:sz w:val="14"/>
         </w:rPr>
-        <w:t xml:space="preserve">Form </w:t>
+        <w:t xml:space="preserve"> </w:t>
       </w:r>
       <w:r>
         <w:rPr>
@@ -3891,10 +4078,21 @@
           <w:rFonts w:ascii="Calibri" w:hAnsi="Calibri"/>
           <w:b/>
           <w:i w:val="0"/>
-          <w:color w:val="1A6450"/>
+          <w:color w:val="0C3F31"/>
+          <w:sz w:val="16"/>
+          <w:shd w:val="clear" w:color="auto" w:fill="C4E3D4"/>
+        </w:rPr>
+        <w:t xml:space="preserve"> Dialectic </w:t>
+      </w:r>
+      <w:r>
+        <w:rPr>
+          <w:rFonts w:ascii="Calibri" w:hAnsi="Calibri"/>
+          <w:b w:val="0"/>
+          <w:i w:val="0"/>
+          <w:color w:val="3C4A42"/>
           <w:sz w:val="14"/>
         </w:rPr>
-        <w:t xml:space="preserve">Dialectic </w:t>
+        <w:t xml:space="preserve"> </w:t>
       </w:r>
       <w:r>
         <w:rPr>
@@ -3928,10 +4126,21 @@
           <w:rFonts w:ascii="Calibri" w:hAnsi="Calibri"/>
           <w:b/>
           <w:i w:val="0"/>
-          <w:color w:val="1A6450"/>
+          <w:color w:val="0C3F31"/>
+          <w:sz w:val="16"/>
+          <w:shd w:val="clear" w:color="auto" w:fill="C4E3D4"/>
+        </w:rPr>
+        <w:t xml:space="preserve"> Kalliopolis </w:t>
+      </w:r>
+      <w:r>
+        <w:rPr>
+          <w:rFonts w:ascii="Calibri" w:hAnsi="Calibri"/>
+          <w:b w:val="0"/>
+          <w:i w:val="0"/>
+          <w:color w:val="3C4A42"/>
           <w:sz w:val="14"/>
         </w:rPr>
-        <w:t xml:space="preserve">Kalliopolis </w:t>
+        <w:t xml:space="preserve"> </w:t>
       </w:r>
       <w:r>
         <w:rPr>
@@ -3965,10 +4174,21 @@
           <w:rFonts w:ascii="Calibri" w:hAnsi="Calibri"/>
           <w:b/>
           <w:i w:val="0"/>
-          <w:color w:val="1A6450"/>
+          <w:color w:val="0C3F31"/>
+          <w:sz w:val="16"/>
+          <w:shd w:val="clear" w:color="auto" w:fill="C4E3D4"/>
+        </w:rPr>
+        <w:t xml:space="preserve"> Philosopher kings </w:t>
+      </w:r>
+      <w:r>
+        <w:rPr>
+          <w:rFonts w:ascii="Calibri" w:hAnsi="Calibri"/>
+          <w:b w:val="0"/>
+          <w:i w:val="0"/>
+          <w:color w:val="3C4A42"/>
           <w:sz w:val="14"/>
         </w:rPr>
-        <w:t xml:space="preserve">Philosopher kings </w:t>
+        <w:t xml:space="preserve"> </w:t>
       </w:r>
       <w:r>
         <w:rPr>
@@ -4020,10 +4240,21 @@
           <w:rFonts w:ascii="Calibri" w:hAnsi="Calibri"/>
           <w:b/>
           <w:i w:val="0"/>
-          <w:color w:val="1A6450"/>
+          <w:color w:val="0C3F31"/>
+          <w:sz w:val="16"/>
+          <w:shd w:val="clear" w:color="auto" w:fill="C4E3D4"/>
+        </w:rPr>
+        <w:t xml:space="preserve"> Empiricism </w:t>
+      </w:r>
+      <w:r>
+        <w:rPr>
+          <w:rFonts w:ascii="Calibri" w:hAnsi="Calibri"/>
+          <w:b w:val="0"/>
+          <w:i w:val="0"/>
+          <w:color w:val="3C4A42"/>
           <w:sz w:val="14"/>
         </w:rPr>
-        <w:t xml:space="preserve">Empiricism </w:t>
+        <w:t xml:space="preserve"> </w:t>
       </w:r>
       <w:r>
         <w:rPr>
@@ -4057,10 +4288,21 @@
           <w:rFonts w:ascii="Calibri" w:hAnsi="Calibri"/>
           <w:b/>
           <w:i w:val="0"/>
-          <w:color w:val="1A6450"/>
+          <w:color w:val="0C3F31"/>
+          <w:sz w:val="16"/>
+          <w:shd w:val="clear" w:color="auto" w:fill="C4E3D4"/>
+        </w:rPr>
+        <w:t xml:space="preserve"> Induction </w:t>
+      </w:r>
+      <w:r>
+        <w:rPr>
+          <w:rFonts w:ascii="Calibri" w:hAnsi="Calibri"/>
+          <w:b w:val="0"/>
+          <w:i w:val="0"/>
+          <w:color w:val="3C4A42"/>
           <w:sz w:val="14"/>
         </w:rPr>
-        <w:t xml:space="preserve">Induction </w:t>
+        <w:t xml:space="preserve"> </w:t>
       </w:r>
       <w:r>
         <w:rPr>
@@ -4084,10 +4326,21 @@
           <w:rFonts w:ascii="Calibri" w:hAnsi="Calibri"/>
           <w:b/>
           <w:i w:val="0"/>
-          <w:color w:val="1A6450"/>
+          <w:color w:val="0C3F31"/>
+          <w:sz w:val="16"/>
+          <w:shd w:val="clear" w:color="auto" w:fill="C4E3D4"/>
+        </w:rPr>
+        <w:t xml:space="preserve"> Foundationalism </w:t>
+      </w:r>
+      <w:r>
+        <w:rPr>
+          <w:rFonts w:ascii="Calibri" w:hAnsi="Calibri"/>
+          <w:b w:val="0"/>
+          <w:i w:val="0"/>
+          <w:color w:val="3C4A42"/>
           <w:sz w:val="14"/>
         </w:rPr>
-        <w:t xml:space="preserve">Foundationalism </w:t>
+        <w:t xml:space="preserve"> </w:t>
       </w:r>
       <w:r>
         <w:rPr>
@@ -4171,10 +4424,21 @@
           <w:rFonts w:ascii="Calibri" w:hAnsi="Calibri"/>
           <w:b/>
           <w:i w:val="0"/>
-          <w:color w:val="1A6450"/>
+          <w:color w:val="0C3F31"/>
+          <w:sz w:val="16"/>
+          <w:shd w:val="clear" w:color="auto" w:fill="C4E3D4"/>
+        </w:rPr>
+        <w:t xml:space="preserve"> Knowledge is power </w:t>
+      </w:r>
+      <w:r>
+        <w:rPr>
+          <w:rFonts w:ascii="Calibri" w:hAnsi="Calibri"/>
+          <w:b w:val="0"/>
+          <w:i w:val="0"/>
+          <w:color w:val="3C4A42"/>
           <w:sz w:val="14"/>
         </w:rPr>
-        <w:t xml:space="preserve">Knowledge is power </w:t>
+        <w:t xml:space="preserve"> </w:t>
       </w:r>
       <w:r>
         <w:rPr>
@@ -4208,10 +4472,21 @@
           <w:rFonts w:ascii="Calibri" w:hAnsi="Calibri"/>
           <w:b/>
           <w:i w:val="0"/>
-          <w:color w:val="1A6450"/>
+          <w:color w:val="0C3F31"/>
+          <w:sz w:val="16"/>
+          <w:shd w:val="clear" w:color="auto" w:fill="C4E3D4"/>
+        </w:rPr>
+        <w:t xml:space="preserve"> Ant, spider, bee </w:t>
+      </w:r>
+      <w:r>
+        <w:rPr>
+          <w:rFonts w:ascii="Calibri" w:hAnsi="Calibri"/>
+          <w:b w:val="0"/>
+          <w:i w:val="0"/>
+          <w:color w:val="3C4A42"/>
           <w:sz w:val="14"/>
         </w:rPr>
-        <w:t xml:space="preserve">Ant, spider, bee </w:t>
+        <w:t xml:space="preserve"> </w:t>
       </w:r>
       <w:r>
         <w:rPr>
@@ -4265,10 +4540,21 @@
           <w:rFonts w:ascii="Calibri" w:hAnsi="Calibri"/>
           <w:b/>
           <w:i w:val="0"/>
-          <w:color w:val="1A6450"/>
+          <w:color w:val="0C3F31"/>
+          <w:sz w:val="16"/>
+          <w:shd w:val="clear" w:color="auto" w:fill="C4E3D4"/>
+        </w:rPr>
+        <w:t xml:space="preserve"> Lynn White Jr. </w:t>
+      </w:r>
+      <w:r>
+        <w:rPr>
+          <w:rFonts w:ascii="Calibri" w:hAnsi="Calibri"/>
+          <w:b w:val="0"/>
+          <w:i w:val="0"/>
+          <w:color w:val="3C4A42"/>
           <w:sz w:val="14"/>
         </w:rPr>
-        <w:t xml:space="preserve">Lynn White Jr. </w:t>
+        <w:t xml:space="preserve"> </w:t>
       </w:r>
       <w:r>
         <w:rPr>
@@ -4292,10 +4578,21 @@
           <w:rFonts w:ascii="Calibri" w:hAnsi="Calibri"/>
           <w:b/>
           <w:i w:val="0"/>
-          <w:color w:val="1A6450"/>
+          <w:color w:val="0C3F31"/>
+          <w:sz w:val="16"/>
+          <w:shd w:val="clear" w:color="auto" w:fill="C4E3D4"/>
+        </w:rPr>
+        <w:t xml:space="preserve"> Deism </w:t>
+      </w:r>
+      <w:r>
+        <w:rPr>
+          <w:rFonts w:ascii="Calibri" w:hAnsi="Calibri"/>
+          <w:b w:val="0"/>
+          <w:i w:val="0"/>
+          <w:color w:val="3C4A42"/>
           <w:sz w:val="14"/>
         </w:rPr>
-        <w:t xml:space="preserve">Deism </w:t>
+        <w:t xml:space="preserve"> </w:t>
       </w:r>
       <w:r>
         <w:rPr>
@@ -4329,10 +4626,21 @@
           <w:rFonts w:ascii="Calibri" w:hAnsi="Calibri"/>
           <w:b/>
           <w:i w:val="0"/>
-          <w:color w:val="1A6450"/>
+          <w:color w:val="0C3F31"/>
+          <w:sz w:val="16"/>
+          <w:shd w:val="clear" w:color="auto" w:fill="C4E3D4"/>
+        </w:rPr>
+        <w:t xml:space="preserve"> Comte's three states </w:t>
+      </w:r>
+      <w:r>
+        <w:rPr>
+          <w:rFonts w:ascii="Calibri" w:hAnsi="Calibri"/>
+          <w:b w:val="0"/>
+          <w:i w:val="0"/>
+          <w:color w:val="3C4A42"/>
           <w:sz w:val="14"/>
         </w:rPr>
-        <w:t xml:space="preserve">Comte's three states </w:t>
+        <w:t xml:space="preserve"> </w:t>
       </w:r>
       <w:r>
         <w:rPr>
@@ -4356,10 +4664,21 @@
           <w:rFonts w:ascii="Calibri" w:hAnsi="Calibri"/>
           <w:b/>
           <w:i w:val="0"/>
-          <w:color w:val="1A6450"/>
+          <w:color w:val="0C3F31"/>
+          <w:sz w:val="16"/>
+          <w:shd w:val="clear" w:color="auto" w:fill="C4E3D4"/>
+        </w:rPr>
+        <w:t xml:space="preserve"> The Vienna Circle </w:t>
+      </w:r>
+      <w:r>
+        <w:rPr>
+          <w:rFonts w:ascii="Calibri" w:hAnsi="Calibri"/>
+          <w:b w:val="0"/>
+          <w:i w:val="0"/>
+          <w:color w:val="3C4A42"/>
           <w:sz w:val="14"/>
         </w:rPr>
-        <w:t xml:space="preserve">The Vienna Circle </w:t>
+        <w:t xml:space="preserve"> </w:t>
       </w:r>
       <w:r>
         <w:rPr>
@@ -4393,10 +4712,21 @@
           <w:rFonts w:ascii="Calibri" w:hAnsi="Calibri"/>
           <w:b/>
           <w:i w:val="0"/>
-          <w:color w:val="1A6450"/>
+          <w:color w:val="0C3F31"/>
+          <w:sz w:val="16"/>
+          <w:shd w:val="clear" w:color="auto" w:fill="C4E3D4"/>
+        </w:rPr>
+        <w:t xml:space="preserve"> Galileo </w:t>
+      </w:r>
+      <w:r>
+        <w:rPr>
+          <w:rFonts w:ascii="Calibri" w:hAnsi="Calibri"/>
+          <w:b w:val="0"/>
+          <w:i w:val="0"/>
+          <w:color w:val="3C4A42"/>
           <w:sz w:val="14"/>
         </w:rPr>
-        <w:t xml:space="preserve">Galileo </w:t>
+        <w:t xml:space="preserve"> </w:t>
       </w:r>
       <w:r>
         <w:rPr>
@@ -4430,10 +4760,21 @@
           <w:rFonts w:ascii="Calibri" w:hAnsi="Calibri"/>
           <w:b/>
           <w:i w:val="0"/>
-          <w:color w:val="1A6450"/>
+          <w:color w:val="0C3F31"/>
+          <w:sz w:val="16"/>
+          <w:shd w:val="clear" w:color="auto" w:fill="C4E3D4"/>
+        </w:rPr>
+        <w:t xml:space="preserve"> Positivism </w:t>
+      </w:r>
+      <w:r>
+        <w:rPr>
+          <w:rFonts w:ascii="Calibri" w:hAnsi="Calibri"/>
+          <w:b w:val="0"/>
+          <w:i w:val="0"/>
+          <w:color w:val="3C4A42"/>
           <w:sz w:val="14"/>
         </w:rPr>
-        <w:t xml:space="preserve">Positivism </w:t>
+        <w:t xml:space="preserve"> </w:t>
       </w:r>
       <w:r>
         <w:rPr>
@@ -4457,10 +4798,21 @@
           <w:rFonts w:ascii="Calibri" w:hAnsi="Calibri"/>
           <w:b/>
           <w:i w:val="0"/>
-          <w:color w:val="1A6450"/>
+          <w:color w:val="0C3F31"/>
+          <w:sz w:val="16"/>
+          <w:shd w:val="clear" w:color="auto" w:fill="C4E3D4"/>
+        </w:rPr>
+        <w:t xml:space="preserve"> Realism </w:t>
+      </w:r>
+      <w:r>
+        <w:rPr>
+          <w:rFonts w:ascii="Calibri" w:hAnsi="Calibri"/>
+          <w:b w:val="0"/>
+          <w:i w:val="0"/>
+          <w:color w:val="3C4A42"/>
           <w:sz w:val="14"/>
         </w:rPr>
-        <w:t xml:space="preserve">Realism </w:t>
+        <w:t xml:space="preserve"> </w:t>
       </w:r>
       <w:r>
         <w:rPr>
@@ -4502,10 +4854,21 @@
           <w:rFonts w:ascii="Calibri" w:hAnsi="Calibri"/>
           <w:b/>
           <w:i w:val="0"/>
-          <w:color w:val="1A6450"/>
+          <w:color w:val="0C3F31"/>
+          <w:sz w:val="16"/>
+          <w:shd w:val="clear" w:color="auto" w:fill="C4E3D4"/>
+        </w:rPr>
+        <w:t xml:space="preserve"> Normal science </w:t>
+      </w:r>
+      <w:r>
+        <w:rPr>
+          <w:rFonts w:ascii="Calibri" w:hAnsi="Calibri"/>
+          <w:b w:val="0"/>
+          <w:i w:val="0"/>
+          <w:color w:val="3C4A42"/>
           <w:sz w:val="14"/>
         </w:rPr>
-        <w:t xml:space="preserve">Normal science </w:t>
+        <w:t xml:space="preserve"> </w:t>
       </w:r>
       <w:r>
         <w:rPr>
@@ -4529,10 +4892,21 @@
           <w:rFonts w:ascii="Calibri" w:hAnsi="Calibri"/>
           <w:b/>
           <w:i w:val="0"/>
-          <w:color w:val="1A6450"/>
+          <w:color w:val="0C3F31"/>
+          <w:sz w:val="16"/>
+          <w:shd w:val="clear" w:color="auto" w:fill="C4E3D4"/>
+        </w:rPr>
+        <w:t xml:space="preserve"> Paradigm </w:t>
+      </w:r>
+      <w:r>
+        <w:rPr>
+          <w:rFonts w:ascii="Calibri" w:hAnsi="Calibri"/>
+          <w:b w:val="0"/>
+          <w:i w:val="0"/>
+          <w:color w:val="3C4A42"/>
           <w:sz w:val="14"/>
         </w:rPr>
-        <w:t xml:space="preserve">Paradigm </w:t>
+        <w:t xml:space="preserve"> </w:t>
       </w:r>
       <w:r>
         <w:rPr>
@@ -4556,10 +4930,21 @@
           <w:rFonts w:ascii="Calibri" w:hAnsi="Calibri"/>
           <w:b/>
           <w:i w:val="0"/>
-          <w:color w:val="1A6450"/>
+          <w:color w:val="0C3F31"/>
+          <w:sz w:val="16"/>
+          <w:shd w:val="clear" w:color="auto" w:fill="C4E3D4"/>
+        </w:rPr>
+        <w:t xml:space="preserve"> Disciplinary matrix </w:t>
+      </w:r>
+      <w:r>
+        <w:rPr>
+          <w:rFonts w:ascii="Calibri" w:hAnsi="Calibri"/>
+          <w:b w:val="0"/>
+          <w:i w:val="0"/>
+          <w:color w:val="3C4A42"/>
           <w:sz w:val="14"/>
         </w:rPr>
-        <w:t xml:space="preserve">Disciplinary matrix </w:t>
+        <w:t xml:space="preserve"> </w:t>
       </w:r>
       <w:r>
         <w:rPr>
@@ -4583,10 +4968,21 @@
           <w:rFonts w:ascii="Calibri" w:hAnsi="Calibri"/>
           <w:b/>
           <w:i w:val="0"/>
-          <w:color w:val="1A6450"/>
+          <w:color w:val="0C3F31"/>
+          <w:sz w:val="16"/>
+          <w:shd w:val="clear" w:color="auto" w:fill="C4E3D4"/>
+        </w:rPr>
+        <w:t xml:space="preserve"> Anomaly </w:t>
+      </w:r>
+      <w:r>
+        <w:rPr>
+          <w:rFonts w:ascii="Calibri" w:hAnsi="Calibri"/>
+          <w:b w:val="0"/>
+          <w:i w:val="0"/>
+          <w:color w:val="3C4A42"/>
           <w:sz w:val="14"/>
         </w:rPr>
-        <w:t xml:space="preserve">Anomaly </w:t>
+        <w:t xml:space="preserve"> </w:t>
       </w:r>
       <w:r>
         <w:rPr>
@@ -4610,10 +5006,21 @@
           <w:rFonts w:ascii="Calibri" w:hAnsi="Calibri"/>
           <w:b/>
           <w:i w:val="0"/>
-          <w:color w:val="1A6450"/>
+          <w:color w:val="0C3F31"/>
+          <w:sz w:val="16"/>
+          <w:shd w:val="clear" w:color="auto" w:fill="C4E3D4"/>
+        </w:rPr>
+        <w:t xml:space="preserve"> Revolution </w:t>
+      </w:r>
+      <w:r>
+        <w:rPr>
+          <w:rFonts w:ascii="Calibri" w:hAnsi="Calibri"/>
+          <w:b w:val="0"/>
+          <w:i w:val="0"/>
+          <w:color w:val="3C4A42"/>
           <w:sz w:val="14"/>
         </w:rPr>
-        <w:t xml:space="preserve">Revolution </w:t>
+        <w:t xml:space="preserve"> </w:t>
       </w:r>
       <w:r>
         <w:rPr>
@@ -4637,10 +5044,21 @@
           <w:rFonts w:ascii="Calibri" w:hAnsi="Calibri"/>
           <w:b/>
           <w:i w:val="0"/>
-          <w:color w:val="1A6450"/>
+          <w:color w:val="0C3F31"/>
+          <w:sz w:val="16"/>
+          <w:shd w:val="clear" w:color="auto" w:fill="C4E3D4"/>
+        </w:rPr>
+        <w:t xml:space="preserve"> Incommensurability </w:t>
+      </w:r>
+      <w:r>
+        <w:rPr>
+          <w:rFonts w:ascii="Calibri" w:hAnsi="Calibri"/>
+          <w:b w:val="0"/>
+          <w:i w:val="0"/>
+          <w:color w:val="3C4A42"/>
           <w:sz w:val="14"/>
         </w:rPr>
-        <w:t xml:space="preserve">Incommensurability </w:t>
+        <w:t xml:space="preserve"> </w:t>
       </w:r>
       <w:r>
         <w:rPr>
@@ -4724,10 +5142,21 @@
           <w:rFonts w:ascii="Calibri" w:hAnsi="Calibri"/>
           <w:b/>
           <w:i w:val="0"/>
-          <w:color w:val="1A6450"/>
+          <w:color w:val="0C3F31"/>
+          <w:sz w:val="16"/>
+          <w:shd w:val="clear" w:color="auto" w:fill="C4E3D4"/>
+        </w:rPr>
+        <w:t xml:space="preserve"> Whig history </w:t>
+      </w:r>
+      <w:r>
+        <w:rPr>
+          <w:rFonts w:ascii="Calibri" w:hAnsi="Calibri"/>
+          <w:b w:val="0"/>
+          <w:i w:val="0"/>
+          <w:color w:val="3C4A42"/>
           <w:sz w:val="14"/>
         </w:rPr>
-        <w:t xml:space="preserve">Whig history </w:t>
+        <w:t xml:space="preserve"> </w:t>
       </w:r>
       <w:r>
         <w:rPr>
@@ -4751,10 +5180,21 @@
           <w:rFonts w:ascii="Calibri" w:hAnsi="Calibri"/>
           <w:b/>
           <w:i w:val="0"/>
-          <w:color w:val="1A6450"/>
+          <w:color w:val="0C3F31"/>
+          <w:sz w:val="16"/>
+          <w:shd w:val="clear" w:color="auto" w:fill="C4E3D4"/>
+        </w:rPr>
+        <w:t xml:space="preserve"> Copernicus </w:t>
+      </w:r>
+      <w:r>
+        <w:rPr>
+          <w:rFonts w:ascii="Calibri" w:hAnsi="Calibri"/>
+          <w:b w:val="0"/>
+          <w:i w:val="0"/>
+          <w:color w:val="3C4A42"/>
           <w:sz w:val="14"/>
         </w:rPr>
-        <w:t xml:space="preserve">Copernicus </w:t>
+        <w:t xml:space="preserve"> </w:t>
       </w:r>
       <w:r>
         <w:rPr>
@@ -4806,10 +5246,21 @@
           <w:rFonts w:ascii="Calibri" w:hAnsi="Calibri"/>
           <w:b/>
           <w:i w:val="0"/>
-          <w:color w:val="1A6450"/>
+          <w:color w:val="0C3F31"/>
+          <w:sz w:val="16"/>
+          <w:shd w:val="clear" w:color="auto" w:fill="C4E3D4"/>
+        </w:rPr>
+        <w:t xml:space="preserve"> Panopticon </w:t>
+      </w:r>
+      <w:r>
+        <w:rPr>
+          <w:rFonts w:ascii="Calibri" w:hAnsi="Calibri"/>
+          <w:b w:val="0"/>
+          <w:i w:val="0"/>
+          <w:color w:val="3C4A42"/>
           <w:sz w:val="14"/>
         </w:rPr>
-        <w:t xml:space="preserve">Panopticon </w:t>
+        <w:t xml:space="preserve"> </w:t>
       </w:r>
       <w:r>
         <w:rPr>
@@ -4843,10 +5294,21 @@
           <w:rFonts w:ascii="Calibri" w:hAnsi="Calibri"/>
           <w:b/>
           <w:i w:val="0"/>
-          <w:color w:val="1A6450"/>
+          <w:color w:val="0C3F31"/>
+          <w:sz w:val="16"/>
+          <w:shd w:val="clear" w:color="auto" w:fill="C4E3D4"/>
+        </w:rPr>
+        <w:t xml:space="preserve"> Bentham's three words </w:t>
+      </w:r>
+      <w:r>
+        <w:rPr>
+          <w:rFonts w:ascii="Calibri" w:hAnsi="Calibri"/>
+          <w:b w:val="0"/>
+          <w:i w:val="0"/>
+          <w:color w:val="3C4A42"/>
           <w:sz w:val="14"/>
         </w:rPr>
-        <w:t xml:space="preserve">Bentham's three words </w:t>
+        <w:t xml:space="preserve"> </w:t>
       </w:r>
       <w:r>
         <w:rPr>
@@ -4870,10 +5332,21 @@
           <w:rFonts w:ascii="Calibri" w:hAnsi="Calibri"/>
           <w:b/>
           <w:i w:val="0"/>
-          <w:color w:val="1A6450"/>
+          <w:color w:val="0C3F31"/>
+          <w:sz w:val="16"/>
+          <w:shd w:val="clear" w:color="auto" w:fill="C4E3D4"/>
+        </w:rPr>
+        <w:t xml:space="preserve"> Utilitarianism </w:t>
+      </w:r>
+      <w:r>
+        <w:rPr>
+          <w:rFonts w:ascii="Calibri" w:hAnsi="Calibri"/>
+          <w:b w:val="0"/>
+          <w:i w:val="0"/>
+          <w:color w:val="3C4A42"/>
           <w:sz w:val="14"/>
         </w:rPr>
-        <w:t xml:space="preserve">Utilitarianism </w:t>
+        <w:t xml:space="preserve"> </w:t>
       </w:r>
       <w:r>
         <w:rPr>
@@ -4907,10 +5380,21 @@
           <w:rFonts w:ascii="Calibri" w:hAnsi="Calibri"/>
           <w:b/>
           <w:i w:val="0"/>
-          <w:color w:val="1A6450"/>
+          <w:color w:val="0C3F31"/>
+          <w:sz w:val="16"/>
+          <w:shd w:val="clear" w:color="auto" w:fill="C4E3D4"/>
+        </w:rPr>
+        <w:t xml:space="preserve"> Three techniques of control </w:t>
+      </w:r>
+      <w:r>
+        <w:rPr>
+          <w:rFonts w:ascii="Calibri" w:hAnsi="Calibri"/>
+          <w:b w:val="0"/>
+          <w:i w:val="0"/>
+          <w:color w:val="3C4A42"/>
           <w:sz w:val="14"/>
         </w:rPr>
-        <w:t xml:space="preserve">Three techniques of control </w:t>
+        <w:t xml:space="preserve"> </w:t>
       </w:r>
       <w:r>
         <w:rPr>
@@ -4934,10 +5418,21 @@
           <w:rFonts w:ascii="Calibri" w:hAnsi="Calibri"/>
           <w:b/>
           <w:i w:val="0"/>
-          <w:color w:val="1A6450"/>
+          <w:color w:val="0C3F31"/>
+          <w:sz w:val="16"/>
+          <w:shd w:val="clear" w:color="auto" w:fill="C4E3D4"/>
+        </w:rPr>
+        <w:t xml:space="preserve"> Power-knowledge </w:t>
+      </w:r>
+      <w:r>
+        <w:rPr>
+          <w:rFonts w:ascii="Calibri" w:hAnsi="Calibri"/>
+          <w:b w:val="0"/>
+          <w:i w:val="0"/>
+          <w:color w:val="3C4A42"/>
           <w:sz w:val="14"/>
         </w:rPr>
-        <w:t xml:space="preserve">Power-knowledge </w:t>
+        <w:t xml:space="preserve"> </w:t>
       </w:r>
       <w:r>
         <w:rPr>
@@ -4961,10 +5456,21 @@
           <w:rFonts w:ascii="Calibri" w:hAnsi="Calibri"/>
           <w:b/>
           <w:i w:val="0"/>
-          <w:color w:val="1A6450"/>
+          <w:color w:val="0C3F31"/>
+          <w:sz w:val="16"/>
+          <w:shd w:val="clear" w:color="auto" w:fill="C4E3D4"/>
+        </w:rPr>
+        <w:t xml:space="preserve"> Normalization </w:t>
+      </w:r>
+      <w:r>
+        <w:rPr>
+          <w:rFonts w:ascii="Calibri" w:hAnsi="Calibri"/>
+          <w:b w:val="0"/>
+          <w:i w:val="0"/>
+          <w:color w:val="3C4A42"/>
           <w:sz w:val="14"/>
         </w:rPr>
-        <w:t xml:space="preserve">Normalization </w:t>
+        <w:t xml:space="preserve"> </w:t>
       </w:r>
       <w:r>
         <w:rPr>
@@ -4988,10 +5494,21 @@
           <w:rFonts w:ascii="Calibri" w:hAnsi="Calibri"/>
           <w:b/>
           <w:i w:val="0"/>
-          <w:color w:val="1A6450"/>
+          <w:color w:val="0C3F31"/>
+          <w:sz w:val="16"/>
+          <w:shd w:val="clear" w:color="auto" w:fill="C4E3D4"/>
+        </w:rPr>
+        <w:t xml:space="preserve"> Docile bodies </w:t>
+      </w:r>
+      <w:r>
+        <w:rPr>
+          <w:rFonts w:ascii="Calibri" w:hAnsi="Calibri"/>
+          <w:b w:val="0"/>
+          <w:i w:val="0"/>
+          <w:color w:val="3C4A42"/>
           <w:sz w:val="14"/>
         </w:rPr>
-        <w:t xml:space="preserve">Docile bodies </w:t>
+        <w:t xml:space="preserve"> </w:t>
       </w:r>
       <w:r>
         <w:rPr>
@@ -5015,10 +5532,21 @@
           <w:rFonts w:ascii="Calibri" w:hAnsi="Calibri"/>
           <w:b/>
           <w:i w:val="0"/>
-          <w:color w:val="1A6450"/>
+          <w:color w:val="0C3F31"/>
+          <w:sz w:val="16"/>
+          <w:shd w:val="clear" w:color="auto" w:fill="C4E3D4"/>
+        </w:rPr>
+        <w:t xml:space="preserve"> Genealogy </w:t>
+      </w:r>
+      <w:r>
+        <w:rPr>
+          <w:rFonts w:ascii="Calibri" w:hAnsi="Calibri"/>
+          <w:b w:val="0"/>
+          <w:i w:val="0"/>
+          <w:color w:val="3C4A42"/>
           <w:sz w:val="14"/>
         </w:rPr>
-        <w:t xml:space="preserve">Genealogy </w:t>
+        <w:t xml:space="preserve"> </w:t>
       </w:r>
       <w:r>
         <w:rPr>
@@ -5062,10 +5590,21 @@
           <w:rFonts w:ascii="Calibri" w:hAnsi="Calibri"/>
           <w:b/>
           <w:i w:val="0"/>
-          <w:color w:val="1A6450"/>
+          <w:color w:val="0C3F31"/>
+          <w:sz w:val="16"/>
+          <w:shd w:val="clear" w:color="auto" w:fill="C4E3D4"/>
+        </w:rPr>
+        <w:t xml:space="preserve"> The plague town </w:t>
+      </w:r>
+      <w:r>
+        <w:rPr>
+          <w:rFonts w:ascii="Calibri" w:hAnsi="Calibri"/>
+          <w:b w:val="0"/>
+          <w:i w:val="0"/>
+          <w:color w:val="3C4A42"/>
           <w:sz w:val="14"/>
         </w:rPr>
-        <w:t xml:space="preserve">The plague town </w:t>
+        <w:t xml:space="preserve"> </w:t>
       </w:r>
       <w:r>
         <w:rPr>
@@ -5109,10 +5648,21 @@
           <w:rFonts w:ascii="Calibri" w:hAnsi="Calibri"/>
           <w:b/>
           <w:i w:val="0"/>
-          <w:color w:val="1A6450"/>
+          <w:color w:val="0C3F31"/>
+          <w:sz w:val="16"/>
+          <w:shd w:val="clear" w:color="auto" w:fill="C4E3D4"/>
+        </w:rPr>
+        <w:t xml:space="preserve"> History of Madness </w:t>
+      </w:r>
+      <w:r>
+        <w:rPr>
+          <w:rFonts w:ascii="Calibri" w:hAnsi="Calibri"/>
+          <w:b w:val="0"/>
+          <w:i w:val="0"/>
+          <w:color w:val="3C4A42"/>
           <w:sz w:val="14"/>
         </w:rPr>
-        <w:t xml:space="preserve">History of Madness </w:t>
+        <w:t xml:space="preserve"> </w:t>
       </w:r>
       <w:r>
         <w:rPr>

</xml_diff>